<commit_message>
docs(report): fill student identity for assignment submission
Refs: TODO 11.3
</commit_message>
<xml_diff>
--- a/Assignment 1/fu-cinema/docs/Assignment 1_Report.docx
+++ b/Assignment 1/fu-cinema/docs/Assignment 1_Report.docx
@@ -66,7 +66,7 @@
           <w:b w:val="0"/>
           <w:color w:val="000000"/>
         </w:rPr>
-        <w:t>Họ tên sinh viên: ................................................</w:t>
+        <w:t>Họ tên sinh viên: Nguyen Quang Minh</w:t>
       </w:r>
     </w:p>
     <w:p>
@@ -82,7 +82,7 @@
           <w:b w:val="0"/>
           <w:color w:val="000000"/>
         </w:rPr>
-        <w:t>Mã sinh viên: ........................    Lớp: ........................</w:t>
+        <w:t>Mã sinh viên: DE190270    Lớp: SE19B04</w:t>
       </w:r>
     </w:p>
     <w:p>
@@ -5152,7 +5152,7 @@
       <w:rPr>
         <w:lang w:val="en-US"/>
       </w:rPr>
-      <w:t xml:space="preserve"> SV:</w:t>
+      <w:t xml:space="preserve"> SV: Nguyen Quang Minh</w:t>
     </w:r>
     <w:r>
       <w:rPr>

</xml_diff>

<commit_message>
fix(report): add automatic table of contents and consistent formatting
Refs: TODO 11.3
</commit_message>
<xml_diff>
--- a/Assignment 1/fu-cinema/docs/Assignment 1_Report.docx
+++ b/Assignment 1/fu-cinema/docs/Assignment 1_Report.docx
@@ -189,370 +189,406 @@
         <w:t>Mục lục</w:t>
       </w:r>
     </w:p>
-    <w:p>
-      <w:pPr>
-        <w:keepLines/>
-        <w:tabs>
-          <w:tab w:pos="9072" w:val="right" w:leader="dot"/>
-        </w:tabs>
-        <w:spacing w:after="100"/>
-        <w:ind w:firstLine="0"/>
-        <w:rPr>
-          <w:lang w:val="en-US"/>
-        </w:rPr>
-      </w:pPr>
-      <w:r>
-        <w:rPr>
-          <w:b w:val="0"/>
-          <w:color w:val="000000"/>
-        </w:rPr>
-      </w:r>
-      <w:hyperlink w:anchor="Overview">
-        <w:r>
-          <w:t>Tổng quan và kết quả kiểm chứng</w:t>
-          <w:tab/>
-          <w:t>3</w:t>
-        </w:r>
-      </w:hyperlink>
-    </w:p>
-    <w:p>
-      <w:pPr>
-        <w:keepLines/>
-        <w:tabs>
-          <w:tab w:pos="9072" w:val="right" w:leader="dot"/>
-        </w:tabs>
-        <w:spacing w:after="100"/>
-        <w:ind w:firstLine="0"/>
-        <w:rPr>
-          <w:lang w:val="en-US"/>
-        </w:rPr>
-      </w:pPr>
-      <w:r>
-        <w:rPr>
-          <w:b w:val="0"/>
-          <w:color w:val="000000"/>
-        </w:rPr>
-      </w:r>
-      <w:hyperlink w:anchor="F0">
-        <w:r>
-          <w:t>F0 Hạ tầng và khởi tạo project</w:t>
-          <w:tab/>
-          <w:t>4</w:t>
-        </w:r>
-      </w:hyperlink>
-    </w:p>
-    <w:p>
-      <w:pPr>
-        <w:keepLines/>
-        <w:tabs>
-          <w:tab w:pos="9072" w:val="right" w:leader="dot"/>
-        </w:tabs>
-        <w:spacing w:after="100"/>
-        <w:ind w:firstLine="0"/>
-        <w:rPr>
-          <w:lang w:val="en-US"/>
-        </w:rPr>
-      </w:pPr>
-      <w:r>
-        <w:rPr>
-          <w:b w:val="0"/>
-          <w:color w:val="000000"/>
-        </w:rPr>
-      </w:r>
-      <w:hyperlink w:anchor="F1">
-        <w:r>
-          <w:t>F1 Authentication</w:t>
-          <w:tab/>
-          <w:t>6</w:t>
-        </w:r>
-      </w:hyperlink>
-    </w:p>
-    <w:p>
-      <w:pPr>
-        <w:keepLines/>
-        <w:tabs>
-          <w:tab w:pos="9072" w:val="right" w:leader="dot"/>
-        </w:tabs>
-        <w:spacing w:after="100"/>
-        <w:ind w:firstLine="0"/>
-        <w:rPr>
-          <w:lang w:val="en-US"/>
-        </w:rPr>
-      </w:pPr>
-      <w:r>
-        <w:rPr>
-          <w:b w:val="0"/>
-          <w:color w:val="000000"/>
-        </w:rPr>
-      </w:r>
-      <w:hyperlink w:anchor="F2">
-        <w:r>
-          <w:t>F2 Đăng ký và quản lý hồ sơ</w:t>
-          <w:tab/>
-          <w:t>8</w:t>
-        </w:r>
-      </w:hyperlink>
-    </w:p>
-    <w:p>
-      <w:pPr>
-        <w:keepLines/>
-        <w:tabs>
-          <w:tab w:pos="9072" w:val="right" w:leader="dot"/>
-        </w:tabs>
-        <w:spacing w:after="100"/>
-        <w:ind w:firstLine="0"/>
-        <w:rPr>
-          <w:lang w:val="en-US"/>
-        </w:rPr>
-      </w:pPr>
-      <w:r>
-        <w:rPr>
-          <w:b w:val="0"/>
-          <w:color w:val="000000"/>
-        </w:rPr>
-      </w:r>
-      <w:hyperlink w:anchor="F3">
-        <w:r>
-          <w:t>F3 Admin quản lý khách hàng</w:t>
-          <w:tab/>
-          <w:t>10</w:t>
-        </w:r>
-      </w:hyperlink>
-    </w:p>
-    <w:p>
-      <w:pPr>
-        <w:keepLines/>
-        <w:tabs>
-          <w:tab w:pos="9072" w:val="right" w:leader="dot"/>
-        </w:tabs>
-        <w:spacing w:after="100"/>
-        <w:ind w:firstLine="0"/>
-        <w:rPr>
-          <w:lang w:val="en-US"/>
-        </w:rPr>
-      </w:pPr>
-      <w:r>
-        <w:rPr>
-          <w:b w:val="0"/>
-          <w:color w:val="000000"/>
-        </w:rPr>
-      </w:r>
-      <w:hyperlink w:anchor="F4">
-        <w:r>
-          <w:t>F4 Thể loại và phòng chiếu</w:t>
-          <w:tab/>
-          <w:t>11</w:t>
-        </w:r>
-      </w:hyperlink>
-    </w:p>
-    <w:p>
-      <w:pPr>
-        <w:keepLines/>
-        <w:tabs>
-          <w:tab w:pos="9072" w:val="right" w:leader="dot"/>
-        </w:tabs>
-        <w:spacing w:after="100"/>
-        <w:ind w:firstLine="0"/>
-        <w:rPr>
-          <w:lang w:val="en-US"/>
-        </w:rPr>
-      </w:pPr>
-      <w:r>
-        <w:rPr>
-          <w:b w:val="0"/>
-          <w:color w:val="000000"/>
-        </w:rPr>
-      </w:r>
-      <w:hyperlink w:anchor="F5">
-        <w:r>
-          <w:t>F5 Danh mục phim</w:t>
-          <w:tab/>
-          <w:t>12</w:t>
-        </w:r>
-      </w:hyperlink>
-    </w:p>
-    <w:p>
-      <w:pPr>
-        <w:keepLines/>
-        <w:tabs>
-          <w:tab w:pos="9072" w:val="right" w:leader="dot"/>
-        </w:tabs>
-        <w:spacing w:after="100"/>
-        <w:ind w:firstLine="0"/>
-        <w:rPr>
-          <w:lang w:val="en-US"/>
-        </w:rPr>
-      </w:pPr>
-      <w:r>
-        <w:rPr>
-          <w:b w:val="0"/>
-          <w:color w:val="000000"/>
-        </w:rPr>
-      </w:r>
-      <w:hyperlink w:anchor="F6">
-        <w:r>
-          <w:t>F6 Quản lý suất chiếu</w:t>
-          <w:tab/>
-          <w:t>13</w:t>
-        </w:r>
-      </w:hyperlink>
-    </w:p>
-    <w:p>
-      <w:pPr>
-        <w:keepLines/>
-        <w:tabs>
-          <w:tab w:pos="9072" w:val="right" w:leader="dot"/>
-        </w:tabs>
-        <w:spacing w:after="100"/>
-        <w:ind w:firstLine="0"/>
-        <w:rPr>
-          <w:lang w:val="en-US"/>
-        </w:rPr>
-      </w:pPr>
-      <w:r>
-        <w:rPr>
-          <w:b w:val="0"/>
-          <w:color w:val="000000"/>
-        </w:rPr>
-      </w:r>
-      <w:hyperlink w:anchor="F7">
-        <w:r>
-          <w:t>F7 Đặt vé qua OpenFeign</w:t>
-          <w:tab/>
-          <w:t>15</w:t>
-        </w:r>
-      </w:hyperlink>
-    </w:p>
-    <w:p>
-      <w:pPr>
-        <w:keepLines/>
-        <w:tabs>
-          <w:tab w:pos="9072" w:val="right" w:leader="dot"/>
-        </w:tabs>
-        <w:spacing w:after="100"/>
-        <w:ind w:firstLine="0"/>
-        <w:rPr>
-          <w:lang w:val="en-US"/>
-        </w:rPr>
-      </w:pPr>
-      <w:r>
-        <w:rPr>
-          <w:b w:val="0"/>
-          <w:color w:val="000000"/>
-        </w:rPr>
-      </w:r>
-      <w:hyperlink w:anchor="F8">
-        <w:r>
-          <w:t>F8 Lịch sử và hủy đặt vé</w:t>
-          <w:tab/>
-          <w:t>17</w:t>
-        </w:r>
-      </w:hyperlink>
-    </w:p>
-    <w:p>
-      <w:pPr>
-        <w:keepLines/>
-        <w:tabs>
-          <w:tab w:pos="9072" w:val="right" w:leader="dot"/>
-        </w:tabs>
-        <w:spacing w:after="100"/>
-        <w:ind w:firstLine="0"/>
-        <w:rPr>
-          <w:lang w:val="en-US"/>
-        </w:rPr>
-      </w:pPr>
-      <w:r>
-        <w:rPr>
-          <w:b w:val="0"/>
-          <w:color w:val="000000"/>
-        </w:rPr>
-      </w:r>
-      <w:hyperlink w:anchor="F9">
-        <w:r>
-          <w:t>F9 Báo cáo doanh thu</w:t>
-          <w:tab/>
-          <w:t>18</w:t>
-        </w:r>
-      </w:hyperlink>
-    </w:p>
-    <w:p>
-      <w:pPr>
-        <w:keepLines/>
-        <w:tabs>
-          <w:tab w:pos="9072" w:val="right" w:leader="dot"/>
-        </w:tabs>
-        <w:spacing w:after="100"/>
-        <w:ind w:firstLine="0"/>
-        <w:rPr>
-          <w:lang w:val="en-US"/>
-        </w:rPr>
-      </w:pPr>
-      <w:r>
-        <w:rPr>
-          <w:b w:val="0"/>
-          <w:color w:val="000000"/>
-        </w:rPr>
-      </w:r>
-      <w:hyperlink w:anchor="F10">
-        <w:r>
-          <w:t>F10 API Gateway và phân quyền</w:t>
-          <w:tab/>
-          <w:t>19</w:t>
-        </w:r>
-      </w:hyperlink>
-    </w:p>
-    <w:p>
-      <w:pPr>
-        <w:keepLines/>
-        <w:tabs>
-          <w:tab w:pos="9072" w:val="right" w:leader="dot"/>
-        </w:tabs>
-        <w:spacing w:after="100"/>
-        <w:ind w:firstLine="0"/>
-        <w:rPr>
-          <w:lang w:val="en-US"/>
-        </w:rPr>
-      </w:pPr>
-      <w:r>
-        <w:rPr>
-          <w:b w:val="0"/>
-          <w:color w:val="000000"/>
-        </w:rPr>
-      </w:r>
-      <w:hyperlink w:anchor="F11">
-        <w:r>
-          <w:t>F11 Kiểm thử Postman và bàn giao</w:t>
-          <w:tab/>
-          <w:t>20</w:t>
-        </w:r>
-      </w:hyperlink>
-    </w:p>
-    <w:p>
-      <w:pPr>
-        <w:keepLines/>
-        <w:tabs>
-          <w:tab w:pos="9072" w:val="right" w:leader="dot"/>
-        </w:tabs>
-        <w:spacing w:after="100"/>
-        <w:ind w:firstLine="0"/>
-        <w:rPr>
-          <w:lang w:val="en-US"/>
-        </w:rPr>
-      </w:pPr>
-      <w:r>
-        <w:rPr>
-          <w:b w:val="0"/>
-          <w:color w:val="000000"/>
-        </w:rPr>
-      </w:r>
-      <w:hyperlink w:anchor="Appendix">
-        <w:r>
-          <w:t>Kiểm thử bổ sung và tài liệu bàn giao</w:t>
-          <w:tab/>
-          <w:t>21</w:t>
-        </w:r>
-      </w:hyperlink>
-    </w:p>
+    <w:sdt>
+      <w:sdtPr>
+        <w:docPartObj>
+          <w:docPartGallery w:val="Table of Contents"/>
+          <w:docPartUnique/>
+        </w:docPartObj>
+      </w:sdtPr>
+      <w:sdtContent>
+        <w:p>
+          <w:pPr>
+            <w:pStyle w:val="TOC1"/>
+            <w:keepLines/>
+            <w:tabs>
+              <w:tab w:pos="9072" w:val="right" w:leader="dot"/>
+            </w:tabs>
+            <w:spacing w:after="100"/>
+            <w:ind w:firstLine="0"/>
+            <w:rPr>
+              <w:lang w:val="en-US"/>
+            </w:rPr>
+          </w:pPr>
+          <w:r>
+            <w:fldChar w:fldCharType="begin" w:dirty="true"/>
+          </w:r>
+          <w:r>
+            <w:instrText xml:space="preserve"> TOC \o "1-1" \h \z \u </w:instrText>
+          </w:r>
+          <w:r>
+            <w:fldChar w:fldCharType="separate"/>
+          </w:r>
+          <w:r>
+            <w:rPr>
+              <w:b w:val="0"/>
+              <w:color w:val="000000"/>
+            </w:rPr>
+          </w:r>
+          <w:hyperlink w:anchor="Overview">
+            <w:r>
+              <w:t>Tổng quan và kết quả kiểm chứng</w:t>
+              <w:tab/>
+              <w:t>3</w:t>
+            </w:r>
+          </w:hyperlink>
+        </w:p>
+        <w:p>
+          <w:pPr>
+            <w:pStyle w:val="TOC1"/>
+            <w:keepLines/>
+            <w:tabs>
+              <w:tab w:pos="9072" w:val="right" w:leader="dot"/>
+            </w:tabs>
+            <w:spacing w:after="100"/>
+            <w:ind w:firstLine="0"/>
+            <w:rPr>
+              <w:lang w:val="en-US"/>
+            </w:rPr>
+          </w:pPr>
+          <w:r>
+            <w:rPr>
+              <w:b w:val="0"/>
+              <w:color w:val="000000"/>
+            </w:rPr>
+          </w:r>
+          <w:hyperlink w:anchor="F0">
+            <w:r>
+              <w:t>F0 Hạ tầng và khởi tạo project</w:t>
+              <w:tab/>
+              <w:t>4</w:t>
+            </w:r>
+          </w:hyperlink>
+        </w:p>
+        <w:p>
+          <w:pPr>
+            <w:pStyle w:val="TOC1"/>
+            <w:keepLines/>
+            <w:tabs>
+              <w:tab w:pos="9072" w:val="right" w:leader="dot"/>
+            </w:tabs>
+            <w:spacing w:after="100"/>
+            <w:ind w:firstLine="0"/>
+            <w:rPr>
+              <w:lang w:val="en-US"/>
+            </w:rPr>
+          </w:pPr>
+          <w:r>
+            <w:rPr>
+              <w:b w:val="0"/>
+              <w:color w:val="000000"/>
+            </w:rPr>
+          </w:r>
+          <w:hyperlink w:anchor="F1">
+            <w:r>
+              <w:t>F1 Authentication</w:t>
+              <w:tab/>
+              <w:t>6</w:t>
+            </w:r>
+          </w:hyperlink>
+        </w:p>
+        <w:p>
+          <w:pPr>
+            <w:pStyle w:val="TOC1"/>
+            <w:keepLines/>
+            <w:tabs>
+              <w:tab w:pos="9072" w:val="right" w:leader="dot"/>
+            </w:tabs>
+            <w:spacing w:after="100"/>
+            <w:ind w:firstLine="0"/>
+            <w:rPr>
+              <w:lang w:val="en-US"/>
+            </w:rPr>
+          </w:pPr>
+          <w:r>
+            <w:rPr>
+              <w:b w:val="0"/>
+              <w:color w:val="000000"/>
+            </w:rPr>
+          </w:r>
+          <w:hyperlink w:anchor="F2">
+            <w:r>
+              <w:t>F2 Đăng ký và quản lý hồ sơ</w:t>
+              <w:tab/>
+              <w:t>8</w:t>
+            </w:r>
+          </w:hyperlink>
+        </w:p>
+        <w:p>
+          <w:pPr>
+            <w:pStyle w:val="TOC1"/>
+            <w:keepLines/>
+            <w:tabs>
+              <w:tab w:pos="9072" w:val="right" w:leader="dot"/>
+            </w:tabs>
+            <w:spacing w:after="100"/>
+            <w:ind w:firstLine="0"/>
+            <w:rPr>
+              <w:lang w:val="en-US"/>
+            </w:rPr>
+          </w:pPr>
+          <w:r>
+            <w:rPr>
+              <w:b w:val="0"/>
+              <w:color w:val="000000"/>
+            </w:rPr>
+          </w:r>
+          <w:hyperlink w:anchor="F3">
+            <w:r>
+              <w:t>F3 Admin quản lý khách hàng</w:t>
+              <w:tab/>
+              <w:t>10</w:t>
+            </w:r>
+          </w:hyperlink>
+        </w:p>
+        <w:p>
+          <w:pPr>
+            <w:pStyle w:val="TOC1"/>
+            <w:keepLines/>
+            <w:tabs>
+              <w:tab w:pos="9072" w:val="right" w:leader="dot"/>
+            </w:tabs>
+            <w:spacing w:after="100"/>
+            <w:ind w:firstLine="0"/>
+            <w:rPr>
+              <w:lang w:val="en-US"/>
+            </w:rPr>
+          </w:pPr>
+          <w:r>
+            <w:rPr>
+              <w:b w:val="0"/>
+              <w:color w:val="000000"/>
+            </w:rPr>
+          </w:r>
+          <w:hyperlink w:anchor="F4">
+            <w:r>
+              <w:t>F4 Thể loại và phòng chiếu</w:t>
+              <w:tab/>
+              <w:t>11</w:t>
+            </w:r>
+          </w:hyperlink>
+        </w:p>
+        <w:p>
+          <w:pPr>
+            <w:pStyle w:val="TOC1"/>
+            <w:keepLines/>
+            <w:tabs>
+              <w:tab w:pos="9072" w:val="right" w:leader="dot"/>
+            </w:tabs>
+            <w:spacing w:after="100"/>
+            <w:ind w:firstLine="0"/>
+            <w:rPr>
+              <w:lang w:val="en-US"/>
+            </w:rPr>
+          </w:pPr>
+          <w:r>
+            <w:rPr>
+              <w:b w:val="0"/>
+              <w:color w:val="000000"/>
+            </w:rPr>
+          </w:r>
+          <w:hyperlink w:anchor="F5">
+            <w:r>
+              <w:t>F5 Danh mục phim</w:t>
+              <w:tab/>
+              <w:t>12</w:t>
+            </w:r>
+          </w:hyperlink>
+        </w:p>
+        <w:p>
+          <w:pPr>
+            <w:pStyle w:val="TOC1"/>
+            <w:keepLines/>
+            <w:tabs>
+              <w:tab w:pos="9072" w:val="right" w:leader="dot"/>
+            </w:tabs>
+            <w:spacing w:after="100"/>
+            <w:ind w:firstLine="0"/>
+            <w:rPr>
+              <w:lang w:val="en-US"/>
+            </w:rPr>
+          </w:pPr>
+          <w:r>
+            <w:rPr>
+              <w:b w:val="0"/>
+              <w:color w:val="000000"/>
+            </w:rPr>
+          </w:r>
+          <w:hyperlink w:anchor="F6">
+            <w:r>
+              <w:t>F6 Quản lý suất chiếu</w:t>
+              <w:tab/>
+              <w:t>13</w:t>
+            </w:r>
+          </w:hyperlink>
+        </w:p>
+        <w:p>
+          <w:pPr>
+            <w:pStyle w:val="TOC1"/>
+            <w:keepLines/>
+            <w:tabs>
+              <w:tab w:pos="9072" w:val="right" w:leader="dot"/>
+            </w:tabs>
+            <w:spacing w:after="100"/>
+            <w:ind w:firstLine="0"/>
+            <w:rPr>
+              <w:lang w:val="en-US"/>
+            </w:rPr>
+          </w:pPr>
+          <w:r>
+            <w:rPr>
+              <w:b w:val="0"/>
+              <w:color w:val="000000"/>
+            </w:rPr>
+          </w:r>
+          <w:hyperlink w:anchor="F7">
+            <w:r>
+              <w:t>F7 Đặt vé qua OpenFeign</w:t>
+              <w:tab/>
+              <w:t>15</w:t>
+            </w:r>
+          </w:hyperlink>
+        </w:p>
+        <w:p>
+          <w:pPr>
+            <w:pStyle w:val="TOC1"/>
+            <w:keepLines/>
+            <w:tabs>
+              <w:tab w:pos="9072" w:val="right" w:leader="dot"/>
+            </w:tabs>
+            <w:spacing w:after="100"/>
+            <w:ind w:firstLine="0"/>
+            <w:rPr>
+              <w:lang w:val="en-US"/>
+            </w:rPr>
+          </w:pPr>
+          <w:r>
+            <w:rPr>
+              <w:b w:val="0"/>
+              <w:color w:val="000000"/>
+            </w:rPr>
+          </w:r>
+          <w:hyperlink w:anchor="F8">
+            <w:r>
+              <w:t>F8 Lịch sử và hủy đặt vé</w:t>
+              <w:tab/>
+              <w:t>17</w:t>
+            </w:r>
+          </w:hyperlink>
+        </w:p>
+        <w:p>
+          <w:pPr>
+            <w:pStyle w:val="TOC1"/>
+            <w:keepLines/>
+            <w:tabs>
+              <w:tab w:pos="9072" w:val="right" w:leader="dot"/>
+            </w:tabs>
+            <w:spacing w:after="100"/>
+            <w:ind w:firstLine="0"/>
+            <w:rPr>
+              <w:lang w:val="en-US"/>
+            </w:rPr>
+          </w:pPr>
+          <w:r>
+            <w:rPr>
+              <w:b w:val="0"/>
+              <w:color w:val="000000"/>
+            </w:rPr>
+          </w:r>
+          <w:hyperlink w:anchor="F9">
+            <w:r>
+              <w:t>F9 Báo cáo doanh thu</w:t>
+              <w:tab/>
+              <w:t>18</w:t>
+            </w:r>
+          </w:hyperlink>
+        </w:p>
+        <w:p>
+          <w:pPr>
+            <w:pStyle w:val="TOC1"/>
+            <w:keepLines/>
+            <w:tabs>
+              <w:tab w:pos="9072" w:val="right" w:leader="dot"/>
+            </w:tabs>
+            <w:spacing w:after="100"/>
+            <w:ind w:firstLine="0"/>
+            <w:rPr>
+              <w:lang w:val="en-US"/>
+            </w:rPr>
+          </w:pPr>
+          <w:r>
+            <w:rPr>
+              <w:b w:val="0"/>
+              <w:color w:val="000000"/>
+            </w:rPr>
+          </w:r>
+          <w:hyperlink w:anchor="F10">
+            <w:r>
+              <w:t>F10 API Gateway và phân quyền</w:t>
+              <w:tab/>
+              <w:t>19</w:t>
+            </w:r>
+          </w:hyperlink>
+        </w:p>
+        <w:p>
+          <w:pPr>
+            <w:pStyle w:val="TOC1"/>
+            <w:keepLines/>
+            <w:tabs>
+              <w:tab w:pos="9072" w:val="right" w:leader="dot"/>
+            </w:tabs>
+            <w:spacing w:after="100"/>
+            <w:ind w:firstLine="0"/>
+            <w:rPr>
+              <w:lang w:val="en-US"/>
+            </w:rPr>
+          </w:pPr>
+          <w:r>
+            <w:rPr>
+              <w:b w:val="0"/>
+              <w:color w:val="000000"/>
+            </w:rPr>
+          </w:r>
+          <w:hyperlink w:anchor="F11">
+            <w:r>
+              <w:t>F11 Kiểm thử Postman và bàn giao</w:t>
+              <w:tab/>
+              <w:t>20</w:t>
+            </w:r>
+          </w:hyperlink>
+        </w:p>
+        <w:p>
+          <w:pPr>
+            <w:pStyle w:val="TOC1"/>
+            <w:keepLines/>
+            <w:tabs>
+              <w:tab w:pos="9072" w:val="right" w:leader="dot"/>
+            </w:tabs>
+            <w:spacing w:after="100"/>
+            <w:ind w:firstLine="0"/>
+            <w:rPr>
+              <w:lang w:val="en-US"/>
+            </w:rPr>
+          </w:pPr>
+          <w:r>
+            <w:rPr>
+              <w:b w:val="0"/>
+              <w:color w:val="000000"/>
+            </w:rPr>
+          </w:r>
+          <w:hyperlink w:anchor="Appendix">
+            <w:r>
+              <w:t>Kiểm thử bổ sung và tài liệu bàn giao</w:t>
+              <w:tab/>
+              <w:t>21</w:t>
+            </w:r>
+          </w:hyperlink>
+          <w:r>
+            <w:fldChar w:fldCharType="end"/>
+          </w:r>
+        </w:p>
+      </w:sdtContent>
+    </w:sdt>
     <w:p>
       <w:pPr>
         <w:pStyle w:val="Heading1"/>
@@ -563,6 +599,10 @@
           <w:ilvl w:val="0"/>
           <w:numId w:val="32"/>
         </w:numPr>
+        <w:ind w:left="540" w:hanging="540"/>
+        <w:tabs>
+          <w:tab w:val="num" w:pos="540"/>
+        </w:tabs>
       </w:pPr>
       <w:bookmarkStart w:id="120" w:name="Overview"/>
       <w:r>
@@ -763,6 +803,10 @@
           <w:ilvl w:val="0"/>
           <w:numId w:val="32"/>
         </w:numPr>
+        <w:ind w:left="540" w:hanging="540"/>
+        <w:tabs>
+          <w:tab w:val="num" w:pos="540"/>
+        </w:tabs>
       </w:pPr>
       <w:bookmarkStart w:id="100" w:name="F0"/>
       <w:r>
@@ -783,6 +827,10 @@
           <w:ilvl w:val="1"/>
           <w:numId w:val="32"/>
         </w:numPr>
+        <w:ind w:left="1080" w:hanging="720"/>
+        <w:tabs>
+          <w:tab w:val="num" w:pos="1080"/>
+        </w:tabs>
       </w:pPr>
       <w:r>
         <w:rPr>
@@ -818,7 +866,7 @@
       </w:pPr>
       <w:r>
         <w:rPr>
-          <w:rFonts w:ascii="Courier New" w:hAnsi="Courier New"/>
+          <w:rFonts w:ascii="Times New Roman" w:hAnsi="Times New Roman" w:eastAsia="Times New Roman" w:cs="Times New Roman"/>
           <w:b w:val="0"/>
           <w:color w:val="000000"/>
           <w:sz w:val="20"/>
@@ -835,6 +883,10 @@
           <w:ilvl w:val="1"/>
           <w:numId w:val="32"/>
         </w:numPr>
+        <w:ind w:left="1080" w:hanging="720"/>
+        <w:tabs>
+          <w:tab w:val="num" w:pos="1080"/>
+        </w:tabs>
       </w:pPr>
       <w:r>
         <w:rPr>
@@ -870,7 +922,7 @@
       </w:pPr>
       <w:r>
         <w:rPr>
-          <w:rFonts w:ascii="Courier New" w:hAnsi="Courier New"/>
+          <w:rFonts w:ascii="Times New Roman" w:hAnsi="Times New Roman" w:eastAsia="Times New Roman" w:cs="Times New Roman"/>
           <w:b w:val="0"/>
           <w:color w:val="000000"/>
           <w:sz w:val="20"/>
@@ -887,6 +939,10 @@
           <w:ilvl w:val="1"/>
           <w:numId w:val="32"/>
         </w:numPr>
+        <w:ind w:left="1080" w:hanging="720"/>
+        <w:tabs>
+          <w:tab w:val="num" w:pos="1080"/>
+        </w:tabs>
       </w:pPr>
       <w:r>
         <w:rPr>
@@ -922,7 +978,7 @@
       </w:pPr>
       <w:r>
         <w:rPr>
-          <w:rFonts w:ascii="Courier New" w:hAnsi="Courier New"/>
+          <w:rFonts w:ascii="Times New Roman" w:hAnsi="Times New Roman" w:eastAsia="Times New Roman" w:cs="Times New Roman"/>
           <w:b w:val="0"/>
           <w:color w:val="000000"/>
           <w:sz w:val="20"/>
@@ -941,7 +997,7 @@
       </w:pPr>
       <w:r>
         <w:rPr>
-          <w:rFonts w:ascii="Courier New" w:hAnsi="Courier New"/>
+          <w:rFonts w:ascii="Times New Roman" w:hAnsi="Times New Roman" w:eastAsia="Times New Roman" w:cs="Times New Roman"/>
           <w:b w:val="0"/>
           <w:color w:val="000000"/>
           <w:sz w:val="20"/>
@@ -960,7 +1016,7 @@
       </w:pPr>
       <w:r>
         <w:rPr>
-          <w:rFonts w:ascii="Courier New" w:hAnsi="Courier New"/>
+          <w:rFonts w:ascii="Times New Roman" w:hAnsi="Times New Roman" w:eastAsia="Times New Roman" w:cs="Times New Roman"/>
           <w:b w:val="0"/>
           <w:color w:val="000000"/>
           <w:sz w:val="20"/>
@@ -979,7 +1035,7 @@
       </w:pPr>
       <w:r>
         <w:rPr>
-          <w:rFonts w:ascii="Courier New" w:hAnsi="Courier New"/>
+          <w:rFonts w:ascii="Times New Roman" w:hAnsi="Times New Roman" w:eastAsia="Times New Roman" w:cs="Times New Roman"/>
           <w:b w:val="0"/>
           <w:color w:val="000000"/>
           <w:sz w:val="20"/>
@@ -996,6 +1052,10 @@
           <w:ilvl w:val="1"/>
           <w:numId w:val="32"/>
         </w:numPr>
+        <w:ind w:left="1080" w:hanging="720"/>
+        <w:tabs>
+          <w:tab w:val="num" w:pos="1080"/>
+        </w:tabs>
       </w:pPr>
       <w:r>
         <w:rPr>
@@ -1031,7 +1091,7 @@
       </w:pPr>
       <w:r>
         <w:rPr>
-          <w:rFonts w:ascii="Courier New" w:hAnsi="Courier New"/>
+          <w:rFonts w:ascii="Times New Roman" w:hAnsi="Times New Roman" w:eastAsia="Times New Roman" w:cs="Times New Roman"/>
           <w:b w:val="0"/>
           <w:color w:val="000000"/>
           <w:sz w:val="20"/>
@@ -1050,7 +1110,7 @@
       </w:pPr>
       <w:r>
         <w:rPr>
-          <w:rFonts w:ascii="Courier New" w:hAnsi="Courier New"/>
+          <w:rFonts w:ascii="Times New Roman" w:hAnsi="Times New Roman" w:eastAsia="Times New Roman" w:cs="Times New Roman"/>
           <w:b w:val="0"/>
           <w:color w:val="000000"/>
           <w:sz w:val="20"/>
@@ -1067,6 +1127,10 @@
           <w:ilvl w:val="1"/>
           <w:numId w:val="32"/>
         </w:numPr>
+        <w:ind w:left="1080" w:hanging="720"/>
+        <w:tabs>
+          <w:tab w:val="num" w:pos="1080"/>
+        </w:tabs>
       </w:pPr>
       <w:r>
         <w:rPr>
@@ -1102,7 +1166,7 @@
       </w:pPr>
       <w:r>
         <w:rPr>
-          <w:rFonts w:ascii="Courier New" w:hAnsi="Courier New"/>
+          <w:rFonts w:ascii="Times New Roman" w:hAnsi="Times New Roman" w:eastAsia="Times New Roman" w:cs="Times New Roman"/>
           <w:b w:val="0"/>
           <w:color w:val="000000"/>
           <w:sz w:val="20"/>
@@ -1121,7 +1185,7 @@
       </w:pPr>
       <w:r>
         <w:rPr>
-          <w:rFonts w:ascii="Courier New" w:hAnsi="Courier New"/>
+          <w:rFonts w:ascii="Times New Roman" w:hAnsi="Times New Roman" w:eastAsia="Times New Roman" w:cs="Times New Roman"/>
           <w:b w:val="0"/>
           <w:color w:val="000000"/>
           <w:sz w:val="20"/>
@@ -1140,7 +1204,7 @@
       </w:pPr>
       <w:r>
         <w:rPr>
-          <w:rFonts w:ascii="Courier New" w:hAnsi="Courier New"/>
+          <w:rFonts w:ascii="Times New Roman" w:hAnsi="Times New Roman" w:eastAsia="Times New Roman" w:cs="Times New Roman"/>
           <w:b w:val="0"/>
           <w:color w:val="000000"/>
           <w:sz w:val="20"/>
@@ -1157,6 +1221,10 @@
           <w:ilvl w:val="1"/>
           <w:numId w:val="32"/>
         </w:numPr>
+        <w:ind w:left="1080" w:hanging="720"/>
+        <w:tabs>
+          <w:tab w:val="num" w:pos="1080"/>
+        </w:tabs>
       </w:pPr>
       <w:r>
         <w:rPr>
@@ -1192,7 +1260,7 @@
       </w:pPr>
       <w:r>
         <w:rPr>
-          <w:rFonts w:ascii="Courier New" w:hAnsi="Courier New"/>
+          <w:rFonts w:ascii="Times New Roman" w:hAnsi="Times New Roman" w:eastAsia="Times New Roman" w:cs="Times New Roman"/>
           <w:b w:val="0"/>
           <w:color w:val="000000"/>
           <w:sz w:val="20"/>
@@ -1211,7 +1279,7 @@
       </w:pPr>
       <w:r>
         <w:rPr>
-          <w:rFonts w:ascii="Courier New" w:hAnsi="Courier New"/>
+          <w:rFonts w:ascii="Times New Roman" w:hAnsi="Times New Roman" w:eastAsia="Times New Roman" w:cs="Times New Roman"/>
           <w:b w:val="0"/>
           <w:color w:val="000000"/>
           <w:sz w:val="20"/>
@@ -1230,7 +1298,7 @@
       </w:pPr>
       <w:r>
         <w:rPr>
-          <w:rFonts w:ascii="Courier New" w:hAnsi="Courier New"/>
+          <w:rFonts w:ascii="Times New Roman" w:hAnsi="Times New Roman" w:eastAsia="Times New Roman" w:cs="Times New Roman"/>
           <w:b w:val="0"/>
           <w:color w:val="000000"/>
           <w:sz w:val="20"/>
@@ -1320,6 +1388,10 @@
           <w:ilvl w:val="0"/>
           <w:numId w:val="32"/>
         </w:numPr>
+        <w:ind w:left="540" w:hanging="540"/>
+        <w:tabs>
+          <w:tab w:val="num" w:pos="540"/>
+        </w:tabs>
       </w:pPr>
       <w:bookmarkStart w:id="101" w:name="F1"/>
       <w:r>
@@ -1340,6 +1412,10 @@
           <w:ilvl w:val="1"/>
           <w:numId w:val="32"/>
         </w:numPr>
+        <w:ind w:left="1080" w:hanging="720"/>
+        <w:tabs>
+          <w:tab w:val="num" w:pos="1080"/>
+        </w:tabs>
       </w:pPr>
       <w:r>
         <w:rPr>
@@ -1375,7 +1451,7 @@
       </w:pPr>
       <w:r>
         <w:rPr>
-          <w:rFonts w:ascii="Courier New" w:hAnsi="Courier New"/>
+          <w:rFonts w:ascii="Times New Roman" w:hAnsi="Times New Roman" w:eastAsia="Times New Roman" w:cs="Times New Roman"/>
           <w:b w:val="0"/>
           <w:color w:val="000000"/>
           <w:sz w:val="20"/>
@@ -1392,6 +1468,10 @@
           <w:ilvl w:val="1"/>
           <w:numId w:val="32"/>
         </w:numPr>
+        <w:ind w:left="1080" w:hanging="720"/>
+        <w:tabs>
+          <w:tab w:val="num" w:pos="1080"/>
+        </w:tabs>
       </w:pPr>
       <w:r>
         <w:rPr>
@@ -1427,7 +1507,7 @@
       </w:pPr>
       <w:r>
         <w:rPr>
-          <w:rFonts w:ascii="Courier New" w:hAnsi="Courier New"/>
+          <w:rFonts w:ascii="Times New Roman" w:hAnsi="Times New Roman" w:eastAsia="Times New Roman" w:cs="Times New Roman"/>
           <w:b w:val="0"/>
           <w:color w:val="000000"/>
           <w:sz w:val="20"/>
@@ -1444,6 +1524,10 @@
           <w:ilvl w:val="1"/>
           <w:numId w:val="32"/>
         </w:numPr>
+        <w:ind w:left="1080" w:hanging="720"/>
+        <w:tabs>
+          <w:tab w:val="num" w:pos="1080"/>
+        </w:tabs>
       </w:pPr>
       <w:r>
         <w:rPr>
@@ -1479,7 +1563,7 @@
       </w:pPr>
       <w:r>
         <w:rPr>
-          <w:rFonts w:ascii="Courier New" w:hAnsi="Courier New"/>
+          <w:rFonts w:ascii="Times New Roman" w:hAnsi="Times New Roman" w:eastAsia="Times New Roman" w:cs="Times New Roman"/>
           <w:b w:val="0"/>
           <w:color w:val="000000"/>
           <w:sz w:val="20"/>
@@ -1496,6 +1580,10 @@
           <w:ilvl w:val="1"/>
           <w:numId w:val="32"/>
         </w:numPr>
+        <w:ind w:left="1080" w:hanging="720"/>
+        <w:tabs>
+          <w:tab w:val="num" w:pos="1080"/>
+        </w:tabs>
       </w:pPr>
       <w:r>
         <w:rPr>
@@ -1531,7 +1619,7 @@
       </w:pPr>
       <w:r>
         <w:rPr>
-          <w:rFonts w:ascii="Courier New" w:hAnsi="Courier New"/>
+          <w:rFonts w:ascii="Times New Roman" w:hAnsi="Times New Roman" w:eastAsia="Times New Roman" w:cs="Times New Roman"/>
           <w:b w:val="0"/>
           <w:color w:val="000000"/>
           <w:sz w:val="20"/>
@@ -1548,6 +1636,10 @@
           <w:ilvl w:val="1"/>
           <w:numId w:val="32"/>
         </w:numPr>
+        <w:ind w:left="1080" w:hanging="720"/>
+        <w:tabs>
+          <w:tab w:val="num" w:pos="1080"/>
+        </w:tabs>
       </w:pPr>
       <w:r>
         <w:rPr>
@@ -1583,7 +1675,7 @@
       </w:pPr>
       <w:r>
         <w:rPr>
-          <w:rFonts w:ascii="Courier New" w:hAnsi="Courier New"/>
+          <w:rFonts w:ascii="Times New Roman" w:hAnsi="Times New Roman" w:eastAsia="Times New Roman" w:cs="Times New Roman"/>
           <w:b w:val="0"/>
           <w:color w:val="000000"/>
           <w:sz w:val="20"/>
@@ -1673,6 +1765,10 @@
           <w:ilvl w:val="0"/>
           <w:numId w:val="32"/>
         </w:numPr>
+        <w:ind w:left="540" w:hanging="540"/>
+        <w:tabs>
+          <w:tab w:val="num" w:pos="540"/>
+        </w:tabs>
       </w:pPr>
       <w:bookmarkStart w:id="102" w:name="F2"/>
       <w:r>
@@ -1693,6 +1789,10 @@
           <w:ilvl w:val="1"/>
           <w:numId w:val="32"/>
         </w:numPr>
+        <w:ind w:left="1080" w:hanging="720"/>
+        <w:tabs>
+          <w:tab w:val="num" w:pos="1080"/>
+        </w:tabs>
       </w:pPr>
       <w:r>
         <w:rPr>
@@ -1728,7 +1828,7 @@
       </w:pPr>
       <w:r>
         <w:rPr>
-          <w:rFonts w:ascii="Courier New" w:hAnsi="Courier New"/>
+          <w:rFonts w:ascii="Times New Roman" w:hAnsi="Times New Roman" w:eastAsia="Times New Roman" w:cs="Times New Roman"/>
           <w:b w:val="0"/>
           <w:color w:val="000000"/>
           <w:sz w:val="20"/>
@@ -1745,6 +1845,10 @@
           <w:ilvl w:val="1"/>
           <w:numId w:val="32"/>
         </w:numPr>
+        <w:ind w:left="1080" w:hanging="720"/>
+        <w:tabs>
+          <w:tab w:val="num" w:pos="1080"/>
+        </w:tabs>
       </w:pPr>
       <w:r>
         <w:rPr>
@@ -1780,7 +1884,7 @@
       </w:pPr>
       <w:r>
         <w:rPr>
-          <w:rFonts w:ascii="Courier New" w:hAnsi="Courier New"/>
+          <w:rFonts w:ascii="Times New Roman" w:hAnsi="Times New Roman" w:eastAsia="Times New Roman" w:cs="Times New Roman"/>
           <w:b w:val="0"/>
           <w:color w:val="000000"/>
           <w:sz w:val="20"/>
@@ -1797,6 +1901,10 @@
           <w:ilvl w:val="1"/>
           <w:numId w:val="32"/>
         </w:numPr>
+        <w:ind w:left="1080" w:hanging="720"/>
+        <w:tabs>
+          <w:tab w:val="num" w:pos="1080"/>
+        </w:tabs>
       </w:pPr>
       <w:r>
         <w:rPr>
@@ -1832,7 +1940,7 @@
       </w:pPr>
       <w:r>
         <w:rPr>
-          <w:rFonts w:ascii="Courier New" w:hAnsi="Courier New"/>
+          <w:rFonts w:ascii="Times New Roman" w:hAnsi="Times New Roman" w:eastAsia="Times New Roman" w:cs="Times New Roman"/>
           <w:b w:val="0"/>
           <w:color w:val="000000"/>
           <w:sz w:val="20"/>
@@ -1849,6 +1957,10 @@
           <w:ilvl w:val="1"/>
           <w:numId w:val="32"/>
         </w:numPr>
+        <w:ind w:left="1080" w:hanging="720"/>
+        <w:tabs>
+          <w:tab w:val="num" w:pos="1080"/>
+        </w:tabs>
       </w:pPr>
       <w:r>
         <w:rPr>
@@ -1884,7 +1996,7 @@
       </w:pPr>
       <w:r>
         <w:rPr>
-          <w:rFonts w:ascii="Courier New" w:hAnsi="Courier New"/>
+          <w:rFonts w:ascii="Times New Roman" w:hAnsi="Times New Roman" w:eastAsia="Times New Roman" w:cs="Times New Roman"/>
           <w:b w:val="0"/>
           <w:color w:val="000000"/>
           <w:sz w:val="20"/>
@@ -1901,6 +2013,10 @@
           <w:ilvl w:val="1"/>
           <w:numId w:val="32"/>
         </w:numPr>
+        <w:ind w:left="1080" w:hanging="720"/>
+        <w:tabs>
+          <w:tab w:val="num" w:pos="1080"/>
+        </w:tabs>
       </w:pPr>
       <w:r>
         <w:rPr>
@@ -1936,7 +2052,7 @@
       </w:pPr>
       <w:r>
         <w:rPr>
-          <w:rFonts w:ascii="Courier New" w:hAnsi="Courier New"/>
+          <w:rFonts w:ascii="Times New Roman" w:hAnsi="Times New Roman" w:eastAsia="Times New Roman" w:cs="Times New Roman"/>
           <w:b w:val="0"/>
           <w:color w:val="000000"/>
           <w:sz w:val="20"/>
@@ -1953,6 +2069,10 @@
           <w:ilvl w:val="1"/>
           <w:numId w:val="32"/>
         </w:numPr>
+        <w:ind w:left="1080" w:hanging="720"/>
+        <w:tabs>
+          <w:tab w:val="num" w:pos="1080"/>
+        </w:tabs>
       </w:pPr>
       <w:r>
         <w:rPr>
@@ -1988,7 +2108,7 @@
       </w:pPr>
       <w:r>
         <w:rPr>
-          <w:rFonts w:ascii="Courier New" w:hAnsi="Courier New"/>
+          <w:rFonts w:ascii="Times New Roman" w:hAnsi="Times New Roman" w:eastAsia="Times New Roman" w:cs="Times New Roman"/>
           <w:b w:val="0"/>
           <w:color w:val="000000"/>
           <w:sz w:val="20"/>
@@ -2078,6 +2198,10 @@
           <w:ilvl w:val="0"/>
           <w:numId w:val="32"/>
         </w:numPr>
+        <w:ind w:left="540" w:hanging="540"/>
+        <w:tabs>
+          <w:tab w:val="num" w:pos="540"/>
+        </w:tabs>
       </w:pPr>
       <w:bookmarkStart w:id="103" w:name="F3"/>
       <w:r>
@@ -2098,6 +2222,10 @@
           <w:ilvl w:val="1"/>
           <w:numId w:val="32"/>
         </w:numPr>
+        <w:ind w:left="1080" w:hanging="720"/>
+        <w:tabs>
+          <w:tab w:val="num" w:pos="1080"/>
+        </w:tabs>
       </w:pPr>
       <w:r>
         <w:rPr>
@@ -2133,7 +2261,7 @@
       </w:pPr>
       <w:r>
         <w:rPr>
-          <w:rFonts w:ascii="Courier New" w:hAnsi="Courier New"/>
+          <w:rFonts w:ascii="Times New Roman" w:hAnsi="Times New Roman" w:eastAsia="Times New Roman" w:cs="Times New Roman"/>
           <w:b w:val="0"/>
           <w:color w:val="000000"/>
           <w:sz w:val="20"/>
@@ -2150,6 +2278,10 @@
           <w:ilvl w:val="1"/>
           <w:numId w:val="32"/>
         </w:numPr>
+        <w:ind w:left="1080" w:hanging="720"/>
+        <w:tabs>
+          <w:tab w:val="num" w:pos="1080"/>
+        </w:tabs>
       </w:pPr>
       <w:r>
         <w:rPr>
@@ -2185,7 +2317,7 @@
       </w:pPr>
       <w:r>
         <w:rPr>
-          <w:rFonts w:ascii="Courier New" w:hAnsi="Courier New"/>
+          <w:rFonts w:ascii="Times New Roman" w:hAnsi="Times New Roman" w:eastAsia="Times New Roman" w:cs="Times New Roman"/>
           <w:b w:val="0"/>
           <w:color w:val="000000"/>
           <w:sz w:val="20"/>
@@ -2202,6 +2334,10 @@
           <w:ilvl w:val="1"/>
           <w:numId w:val="32"/>
         </w:numPr>
+        <w:ind w:left="1080" w:hanging="720"/>
+        <w:tabs>
+          <w:tab w:val="num" w:pos="1080"/>
+        </w:tabs>
       </w:pPr>
       <w:r>
         <w:rPr>
@@ -2237,7 +2373,7 @@
       </w:pPr>
       <w:r>
         <w:rPr>
-          <w:rFonts w:ascii="Courier New" w:hAnsi="Courier New"/>
+          <w:rFonts w:ascii="Times New Roman" w:hAnsi="Times New Roman" w:eastAsia="Times New Roman" w:cs="Times New Roman"/>
           <w:b w:val="0"/>
           <w:color w:val="000000"/>
           <w:sz w:val="20"/>
@@ -2327,6 +2463,10 @@
           <w:ilvl w:val="0"/>
           <w:numId w:val="32"/>
         </w:numPr>
+        <w:ind w:left="540" w:hanging="540"/>
+        <w:tabs>
+          <w:tab w:val="num" w:pos="540"/>
+        </w:tabs>
       </w:pPr>
       <w:bookmarkStart w:id="104" w:name="F4"/>
       <w:r>
@@ -2347,6 +2487,10 @@
           <w:ilvl w:val="1"/>
           <w:numId w:val="32"/>
         </w:numPr>
+        <w:ind w:left="1080" w:hanging="720"/>
+        <w:tabs>
+          <w:tab w:val="num" w:pos="1080"/>
+        </w:tabs>
       </w:pPr>
       <w:r>
         <w:rPr>
@@ -2382,7 +2526,7 @@
       </w:pPr>
       <w:r>
         <w:rPr>
-          <w:rFonts w:ascii="Courier New" w:hAnsi="Courier New"/>
+          <w:rFonts w:ascii="Times New Roman" w:hAnsi="Times New Roman" w:eastAsia="Times New Roman" w:cs="Times New Roman"/>
           <w:b w:val="0"/>
           <w:color w:val="000000"/>
           <w:sz w:val="20"/>
@@ -2399,6 +2543,10 @@
           <w:ilvl w:val="1"/>
           <w:numId w:val="32"/>
         </w:numPr>
+        <w:ind w:left="1080" w:hanging="720"/>
+        <w:tabs>
+          <w:tab w:val="num" w:pos="1080"/>
+        </w:tabs>
       </w:pPr>
       <w:r>
         <w:rPr>
@@ -2434,7 +2582,7 @@
       </w:pPr>
       <w:r>
         <w:rPr>
-          <w:rFonts w:ascii="Courier New" w:hAnsi="Courier New"/>
+          <w:rFonts w:ascii="Times New Roman" w:hAnsi="Times New Roman" w:eastAsia="Times New Roman" w:cs="Times New Roman"/>
           <w:b w:val="0"/>
           <w:color w:val="000000"/>
           <w:sz w:val="20"/>
@@ -2451,6 +2599,10 @@
           <w:ilvl w:val="1"/>
           <w:numId w:val="32"/>
         </w:numPr>
+        <w:ind w:left="1080" w:hanging="720"/>
+        <w:tabs>
+          <w:tab w:val="num" w:pos="1080"/>
+        </w:tabs>
       </w:pPr>
       <w:r>
         <w:rPr>
@@ -2486,7 +2638,7 @@
       </w:pPr>
       <w:r>
         <w:rPr>
-          <w:rFonts w:ascii="Courier New" w:hAnsi="Courier New"/>
+          <w:rFonts w:ascii="Times New Roman" w:hAnsi="Times New Roman" w:eastAsia="Times New Roman" w:cs="Times New Roman"/>
           <w:b w:val="0"/>
           <w:color w:val="000000"/>
           <w:sz w:val="20"/>
@@ -2503,6 +2655,10 @@
           <w:ilvl w:val="1"/>
           <w:numId w:val="32"/>
         </w:numPr>
+        <w:ind w:left="1080" w:hanging="720"/>
+        <w:tabs>
+          <w:tab w:val="num" w:pos="1080"/>
+        </w:tabs>
       </w:pPr>
       <w:r>
         <w:rPr>
@@ -2538,7 +2694,7 @@
       </w:pPr>
       <w:r>
         <w:rPr>
-          <w:rFonts w:ascii="Courier New" w:hAnsi="Courier New"/>
+          <w:rFonts w:ascii="Times New Roman" w:hAnsi="Times New Roman" w:eastAsia="Times New Roman" w:cs="Times New Roman"/>
           <w:b w:val="0"/>
           <w:color w:val="000000"/>
           <w:sz w:val="20"/>
@@ -2628,6 +2784,10 @@
           <w:ilvl w:val="0"/>
           <w:numId w:val="32"/>
         </w:numPr>
+        <w:ind w:left="540" w:hanging="540"/>
+        <w:tabs>
+          <w:tab w:val="num" w:pos="540"/>
+        </w:tabs>
       </w:pPr>
       <w:bookmarkStart w:id="105" w:name="F5"/>
       <w:r>
@@ -2648,6 +2808,10 @@
           <w:ilvl w:val="1"/>
           <w:numId w:val="32"/>
         </w:numPr>
+        <w:ind w:left="1080" w:hanging="720"/>
+        <w:tabs>
+          <w:tab w:val="num" w:pos="1080"/>
+        </w:tabs>
       </w:pPr>
       <w:r>
         <w:rPr>
@@ -2683,7 +2847,7 @@
       </w:pPr>
       <w:r>
         <w:rPr>
-          <w:rFonts w:ascii="Courier New" w:hAnsi="Courier New"/>
+          <w:rFonts w:ascii="Times New Roman" w:hAnsi="Times New Roman" w:eastAsia="Times New Roman" w:cs="Times New Roman"/>
           <w:b w:val="0"/>
           <w:color w:val="000000"/>
           <w:sz w:val="20"/>
@@ -2700,6 +2864,10 @@
           <w:ilvl w:val="1"/>
           <w:numId w:val="32"/>
         </w:numPr>
+        <w:ind w:left="1080" w:hanging="720"/>
+        <w:tabs>
+          <w:tab w:val="num" w:pos="1080"/>
+        </w:tabs>
       </w:pPr>
       <w:r>
         <w:rPr>
@@ -2735,7 +2903,7 @@
       </w:pPr>
       <w:r>
         <w:rPr>
-          <w:rFonts w:ascii="Courier New" w:hAnsi="Courier New"/>
+          <w:rFonts w:ascii="Times New Roman" w:hAnsi="Times New Roman" w:eastAsia="Times New Roman" w:cs="Times New Roman"/>
           <w:b w:val="0"/>
           <w:color w:val="000000"/>
           <w:sz w:val="20"/>
@@ -2752,6 +2920,10 @@
           <w:ilvl w:val="1"/>
           <w:numId w:val="32"/>
         </w:numPr>
+        <w:ind w:left="1080" w:hanging="720"/>
+        <w:tabs>
+          <w:tab w:val="num" w:pos="1080"/>
+        </w:tabs>
       </w:pPr>
       <w:r>
         <w:rPr>
@@ -2787,7 +2959,7 @@
       </w:pPr>
       <w:r>
         <w:rPr>
-          <w:rFonts w:ascii="Courier New" w:hAnsi="Courier New"/>
+          <w:rFonts w:ascii="Times New Roman" w:hAnsi="Times New Roman" w:eastAsia="Times New Roman" w:cs="Times New Roman"/>
           <w:b w:val="0"/>
           <w:color w:val="000000"/>
           <w:sz w:val="20"/>
@@ -2804,6 +2976,10 @@
           <w:ilvl w:val="1"/>
           <w:numId w:val="32"/>
         </w:numPr>
+        <w:ind w:left="1080" w:hanging="720"/>
+        <w:tabs>
+          <w:tab w:val="num" w:pos="1080"/>
+        </w:tabs>
       </w:pPr>
       <w:r>
         <w:rPr>
@@ -2839,7 +3015,7 @@
       </w:pPr>
       <w:r>
         <w:rPr>
-          <w:rFonts w:ascii="Courier New" w:hAnsi="Courier New"/>
+          <w:rFonts w:ascii="Times New Roman" w:hAnsi="Times New Roman" w:eastAsia="Times New Roman" w:cs="Times New Roman"/>
           <w:b w:val="0"/>
           <w:color w:val="000000"/>
           <w:sz w:val="20"/>
@@ -2929,6 +3105,10 @@
           <w:ilvl w:val="0"/>
           <w:numId w:val="32"/>
         </w:numPr>
+        <w:ind w:left="540" w:hanging="540"/>
+        <w:tabs>
+          <w:tab w:val="num" w:pos="540"/>
+        </w:tabs>
       </w:pPr>
       <w:bookmarkStart w:id="106" w:name="F6"/>
       <w:r>
@@ -2949,6 +3129,10 @@
           <w:ilvl w:val="1"/>
           <w:numId w:val="32"/>
         </w:numPr>
+        <w:ind w:left="1080" w:hanging="720"/>
+        <w:tabs>
+          <w:tab w:val="num" w:pos="1080"/>
+        </w:tabs>
       </w:pPr>
       <w:r>
         <w:rPr>
@@ -2984,7 +3168,7 @@
       </w:pPr>
       <w:r>
         <w:rPr>
-          <w:rFonts w:ascii="Courier New" w:hAnsi="Courier New"/>
+          <w:rFonts w:ascii="Times New Roman" w:hAnsi="Times New Roman" w:eastAsia="Times New Roman" w:cs="Times New Roman"/>
           <w:b w:val="0"/>
           <w:color w:val="000000"/>
           <w:sz w:val="20"/>
@@ -3001,6 +3185,10 @@
           <w:ilvl w:val="1"/>
           <w:numId w:val="32"/>
         </w:numPr>
+        <w:ind w:left="1080" w:hanging="720"/>
+        <w:tabs>
+          <w:tab w:val="num" w:pos="1080"/>
+        </w:tabs>
       </w:pPr>
       <w:r>
         <w:rPr>
@@ -3036,7 +3224,7 @@
       </w:pPr>
       <w:r>
         <w:rPr>
-          <w:rFonts w:ascii="Courier New" w:hAnsi="Courier New"/>
+          <w:rFonts w:ascii="Times New Roman" w:hAnsi="Times New Roman" w:eastAsia="Times New Roman" w:cs="Times New Roman"/>
           <w:b w:val="0"/>
           <w:color w:val="000000"/>
           <w:sz w:val="20"/>
@@ -3053,6 +3241,10 @@
           <w:ilvl w:val="1"/>
           <w:numId w:val="32"/>
         </w:numPr>
+        <w:ind w:left="1080" w:hanging="720"/>
+        <w:tabs>
+          <w:tab w:val="num" w:pos="1080"/>
+        </w:tabs>
       </w:pPr>
       <w:r>
         <w:rPr>
@@ -3088,7 +3280,7 @@
       </w:pPr>
       <w:r>
         <w:rPr>
-          <w:rFonts w:ascii="Courier New" w:hAnsi="Courier New"/>
+          <w:rFonts w:ascii="Times New Roman" w:hAnsi="Times New Roman" w:eastAsia="Times New Roman" w:cs="Times New Roman"/>
           <w:b w:val="0"/>
           <w:color w:val="000000"/>
           <w:sz w:val="20"/>
@@ -3105,6 +3297,10 @@
           <w:ilvl w:val="1"/>
           <w:numId w:val="32"/>
         </w:numPr>
+        <w:ind w:left="1080" w:hanging="720"/>
+        <w:tabs>
+          <w:tab w:val="num" w:pos="1080"/>
+        </w:tabs>
       </w:pPr>
       <w:r>
         <w:rPr>
@@ -3140,7 +3336,7 @@
       </w:pPr>
       <w:r>
         <w:rPr>
-          <w:rFonts w:ascii="Courier New" w:hAnsi="Courier New"/>
+          <w:rFonts w:ascii="Times New Roman" w:hAnsi="Times New Roman" w:eastAsia="Times New Roman" w:cs="Times New Roman"/>
           <w:b w:val="0"/>
           <w:color w:val="000000"/>
           <w:sz w:val="20"/>
@@ -3157,6 +3353,10 @@
           <w:ilvl w:val="1"/>
           <w:numId w:val="32"/>
         </w:numPr>
+        <w:ind w:left="1080" w:hanging="720"/>
+        <w:tabs>
+          <w:tab w:val="num" w:pos="1080"/>
+        </w:tabs>
       </w:pPr>
       <w:r>
         <w:rPr>
@@ -3192,7 +3392,7 @@
       </w:pPr>
       <w:r>
         <w:rPr>
-          <w:rFonts w:ascii="Courier New" w:hAnsi="Courier New"/>
+          <w:rFonts w:ascii="Times New Roman" w:hAnsi="Times New Roman" w:eastAsia="Times New Roman" w:cs="Times New Roman"/>
           <w:b w:val="0"/>
           <w:color w:val="000000"/>
           <w:sz w:val="20"/>
@@ -3282,6 +3482,10 @@
           <w:ilvl w:val="0"/>
           <w:numId w:val="32"/>
         </w:numPr>
+        <w:ind w:left="540" w:hanging="540"/>
+        <w:tabs>
+          <w:tab w:val="num" w:pos="540"/>
+        </w:tabs>
       </w:pPr>
       <w:bookmarkStart w:id="107" w:name="F7"/>
       <w:r>
@@ -3302,6 +3506,10 @@
           <w:ilvl w:val="1"/>
           <w:numId w:val="32"/>
         </w:numPr>
+        <w:ind w:left="1080" w:hanging="720"/>
+        <w:tabs>
+          <w:tab w:val="num" w:pos="1080"/>
+        </w:tabs>
       </w:pPr>
       <w:r>
         <w:rPr>
@@ -3337,7 +3545,7 @@
       </w:pPr>
       <w:r>
         <w:rPr>
-          <w:rFonts w:ascii="Courier New" w:hAnsi="Courier New"/>
+          <w:rFonts w:ascii="Times New Roman" w:hAnsi="Times New Roman" w:eastAsia="Times New Roman" w:cs="Times New Roman"/>
           <w:b w:val="0"/>
           <w:color w:val="000000"/>
           <w:sz w:val="20"/>
@@ -3354,6 +3562,10 @@
           <w:ilvl w:val="1"/>
           <w:numId w:val="32"/>
         </w:numPr>
+        <w:ind w:left="1080" w:hanging="720"/>
+        <w:tabs>
+          <w:tab w:val="num" w:pos="1080"/>
+        </w:tabs>
       </w:pPr>
       <w:r>
         <w:rPr>
@@ -3389,7 +3601,7 @@
       </w:pPr>
       <w:r>
         <w:rPr>
-          <w:rFonts w:ascii="Courier New" w:hAnsi="Courier New"/>
+          <w:rFonts w:ascii="Times New Roman" w:hAnsi="Times New Roman" w:eastAsia="Times New Roman" w:cs="Times New Roman"/>
           <w:b w:val="0"/>
           <w:color w:val="000000"/>
           <w:sz w:val="20"/>
@@ -3406,6 +3618,10 @@
           <w:ilvl w:val="1"/>
           <w:numId w:val="32"/>
         </w:numPr>
+        <w:ind w:left="1080" w:hanging="720"/>
+        <w:tabs>
+          <w:tab w:val="num" w:pos="1080"/>
+        </w:tabs>
       </w:pPr>
       <w:r>
         <w:rPr>
@@ -3441,7 +3657,7 @@
       </w:pPr>
       <w:r>
         <w:rPr>
-          <w:rFonts w:ascii="Courier New" w:hAnsi="Courier New"/>
+          <w:rFonts w:ascii="Times New Roman" w:hAnsi="Times New Roman" w:eastAsia="Times New Roman" w:cs="Times New Roman"/>
           <w:b w:val="0"/>
           <w:color w:val="000000"/>
           <w:sz w:val="20"/>
@@ -3458,6 +3674,10 @@
           <w:ilvl w:val="1"/>
           <w:numId w:val="32"/>
         </w:numPr>
+        <w:ind w:left="1080" w:hanging="720"/>
+        <w:tabs>
+          <w:tab w:val="num" w:pos="1080"/>
+        </w:tabs>
       </w:pPr>
       <w:r>
         <w:rPr>
@@ -3493,7 +3713,7 @@
       </w:pPr>
       <w:r>
         <w:rPr>
-          <w:rFonts w:ascii="Courier New" w:hAnsi="Courier New"/>
+          <w:rFonts w:ascii="Times New Roman" w:hAnsi="Times New Roman" w:eastAsia="Times New Roman" w:cs="Times New Roman"/>
           <w:b w:val="0"/>
           <w:color w:val="000000"/>
           <w:sz w:val="20"/>
@@ -3510,6 +3730,10 @@
           <w:ilvl w:val="1"/>
           <w:numId w:val="32"/>
         </w:numPr>
+        <w:ind w:left="1080" w:hanging="720"/>
+        <w:tabs>
+          <w:tab w:val="num" w:pos="1080"/>
+        </w:tabs>
       </w:pPr>
       <w:r>
         <w:rPr>
@@ -3545,7 +3769,7 @@
       </w:pPr>
       <w:r>
         <w:rPr>
-          <w:rFonts w:ascii="Courier New" w:hAnsi="Courier New"/>
+          <w:rFonts w:ascii="Times New Roman" w:hAnsi="Times New Roman" w:eastAsia="Times New Roman" w:cs="Times New Roman"/>
           <w:b w:val="0"/>
           <w:color w:val="000000"/>
           <w:sz w:val="20"/>
@@ -3562,6 +3786,10 @@
           <w:ilvl w:val="1"/>
           <w:numId w:val="32"/>
         </w:numPr>
+        <w:ind w:left="1080" w:hanging="720"/>
+        <w:tabs>
+          <w:tab w:val="num" w:pos="1080"/>
+        </w:tabs>
       </w:pPr>
       <w:r>
         <w:rPr>
@@ -3597,7 +3825,7 @@
       </w:pPr>
       <w:r>
         <w:rPr>
-          <w:rFonts w:ascii="Courier New" w:hAnsi="Courier New"/>
+          <w:rFonts w:ascii="Times New Roman" w:hAnsi="Times New Roman" w:eastAsia="Times New Roman" w:cs="Times New Roman"/>
           <w:b w:val="0"/>
           <w:color w:val="000000"/>
           <w:sz w:val="20"/>
@@ -3614,6 +3842,10 @@
           <w:ilvl w:val="1"/>
           <w:numId w:val="32"/>
         </w:numPr>
+        <w:ind w:left="1080" w:hanging="720"/>
+        <w:tabs>
+          <w:tab w:val="num" w:pos="1080"/>
+        </w:tabs>
       </w:pPr>
       <w:r>
         <w:rPr>
@@ -3649,7 +3881,7 @@
       </w:pPr>
       <w:r>
         <w:rPr>
-          <w:rFonts w:ascii="Courier New" w:hAnsi="Courier New"/>
+          <w:rFonts w:ascii="Times New Roman" w:hAnsi="Times New Roman" w:eastAsia="Times New Roman" w:cs="Times New Roman"/>
           <w:b w:val="0"/>
           <w:color w:val="000000"/>
           <w:sz w:val="20"/>
@@ -3739,6 +3971,10 @@
           <w:ilvl w:val="0"/>
           <w:numId w:val="32"/>
         </w:numPr>
+        <w:ind w:left="540" w:hanging="540"/>
+        <w:tabs>
+          <w:tab w:val="num" w:pos="540"/>
+        </w:tabs>
       </w:pPr>
       <w:bookmarkStart w:id="108" w:name="F8"/>
       <w:r>
@@ -3759,6 +3995,10 @@
           <w:ilvl w:val="1"/>
           <w:numId w:val="32"/>
         </w:numPr>
+        <w:ind w:left="1080" w:hanging="720"/>
+        <w:tabs>
+          <w:tab w:val="num" w:pos="1080"/>
+        </w:tabs>
       </w:pPr>
       <w:r>
         <w:rPr>
@@ -3794,7 +4034,7 @@
       </w:pPr>
       <w:r>
         <w:rPr>
-          <w:rFonts w:ascii="Courier New" w:hAnsi="Courier New"/>
+          <w:rFonts w:ascii="Times New Roman" w:hAnsi="Times New Roman" w:eastAsia="Times New Roman" w:cs="Times New Roman"/>
           <w:b w:val="0"/>
           <w:color w:val="000000"/>
           <w:sz w:val="20"/>
@@ -3811,6 +4051,10 @@
           <w:ilvl w:val="1"/>
           <w:numId w:val="32"/>
         </w:numPr>
+        <w:ind w:left="1080" w:hanging="720"/>
+        <w:tabs>
+          <w:tab w:val="num" w:pos="1080"/>
+        </w:tabs>
       </w:pPr>
       <w:r>
         <w:rPr>
@@ -3846,7 +4090,7 @@
       </w:pPr>
       <w:r>
         <w:rPr>
-          <w:rFonts w:ascii="Courier New" w:hAnsi="Courier New"/>
+          <w:rFonts w:ascii="Times New Roman" w:hAnsi="Times New Roman" w:eastAsia="Times New Roman" w:cs="Times New Roman"/>
           <w:b w:val="0"/>
           <w:color w:val="000000"/>
           <w:sz w:val="20"/>
@@ -3863,6 +4107,10 @@
           <w:ilvl w:val="1"/>
           <w:numId w:val="32"/>
         </w:numPr>
+        <w:ind w:left="1080" w:hanging="720"/>
+        <w:tabs>
+          <w:tab w:val="num" w:pos="1080"/>
+        </w:tabs>
       </w:pPr>
       <w:r>
         <w:rPr>
@@ -3898,7 +4146,7 @@
       </w:pPr>
       <w:r>
         <w:rPr>
-          <w:rFonts w:ascii="Courier New" w:hAnsi="Courier New"/>
+          <w:rFonts w:ascii="Times New Roman" w:hAnsi="Times New Roman" w:eastAsia="Times New Roman" w:cs="Times New Roman"/>
           <w:b w:val="0"/>
           <w:color w:val="000000"/>
           <w:sz w:val="20"/>
@@ -3915,6 +4163,10 @@
           <w:ilvl w:val="1"/>
           <w:numId w:val="32"/>
         </w:numPr>
+        <w:ind w:left="1080" w:hanging="720"/>
+        <w:tabs>
+          <w:tab w:val="num" w:pos="1080"/>
+        </w:tabs>
       </w:pPr>
       <w:r>
         <w:rPr>
@@ -3950,7 +4202,7 @@
       </w:pPr>
       <w:r>
         <w:rPr>
-          <w:rFonts w:ascii="Courier New" w:hAnsi="Courier New"/>
+          <w:rFonts w:ascii="Times New Roman" w:hAnsi="Times New Roman" w:eastAsia="Times New Roman" w:cs="Times New Roman"/>
           <w:b w:val="0"/>
           <w:color w:val="000000"/>
           <w:sz w:val="20"/>
@@ -4040,6 +4292,10 @@
           <w:ilvl w:val="0"/>
           <w:numId w:val="32"/>
         </w:numPr>
+        <w:ind w:left="540" w:hanging="540"/>
+        <w:tabs>
+          <w:tab w:val="num" w:pos="540"/>
+        </w:tabs>
       </w:pPr>
       <w:bookmarkStart w:id="109" w:name="F9"/>
       <w:r>
@@ -4060,6 +4316,10 @@
           <w:ilvl w:val="1"/>
           <w:numId w:val="32"/>
         </w:numPr>
+        <w:ind w:left="1080" w:hanging="720"/>
+        <w:tabs>
+          <w:tab w:val="num" w:pos="1080"/>
+        </w:tabs>
       </w:pPr>
       <w:r>
         <w:rPr>
@@ -4095,7 +4355,7 @@
       </w:pPr>
       <w:r>
         <w:rPr>
-          <w:rFonts w:ascii="Courier New" w:hAnsi="Courier New"/>
+          <w:rFonts w:ascii="Times New Roman" w:hAnsi="Times New Roman" w:eastAsia="Times New Roman" w:cs="Times New Roman"/>
           <w:b w:val="0"/>
           <w:color w:val="000000"/>
           <w:sz w:val="20"/>
@@ -4112,6 +4372,10 @@
           <w:ilvl w:val="1"/>
           <w:numId w:val="32"/>
         </w:numPr>
+        <w:ind w:left="1080" w:hanging="720"/>
+        <w:tabs>
+          <w:tab w:val="num" w:pos="1080"/>
+        </w:tabs>
       </w:pPr>
       <w:r>
         <w:rPr>
@@ -4147,7 +4411,7 @@
       </w:pPr>
       <w:r>
         <w:rPr>
-          <w:rFonts w:ascii="Courier New" w:hAnsi="Courier New"/>
+          <w:rFonts w:ascii="Times New Roman" w:hAnsi="Times New Roman" w:eastAsia="Times New Roman" w:cs="Times New Roman"/>
           <w:b w:val="0"/>
           <w:color w:val="000000"/>
           <w:sz w:val="20"/>
@@ -4164,6 +4428,10 @@
           <w:ilvl w:val="1"/>
           <w:numId w:val="32"/>
         </w:numPr>
+        <w:ind w:left="1080" w:hanging="720"/>
+        <w:tabs>
+          <w:tab w:val="num" w:pos="1080"/>
+        </w:tabs>
       </w:pPr>
       <w:r>
         <w:rPr>
@@ -4199,7 +4467,7 @@
       </w:pPr>
       <w:r>
         <w:rPr>
-          <w:rFonts w:ascii="Courier New" w:hAnsi="Courier New"/>
+          <w:rFonts w:ascii="Times New Roman" w:hAnsi="Times New Roman" w:eastAsia="Times New Roman" w:cs="Times New Roman"/>
           <w:b w:val="0"/>
           <w:color w:val="000000"/>
           <w:sz w:val="20"/>
@@ -4289,6 +4557,10 @@
           <w:ilvl w:val="0"/>
           <w:numId w:val="32"/>
         </w:numPr>
+        <w:ind w:left="540" w:hanging="540"/>
+        <w:tabs>
+          <w:tab w:val="num" w:pos="540"/>
+        </w:tabs>
       </w:pPr>
       <w:bookmarkStart w:id="110" w:name="F10"/>
       <w:r>
@@ -4309,6 +4581,10 @@
           <w:ilvl w:val="1"/>
           <w:numId w:val="32"/>
         </w:numPr>
+        <w:ind w:left="1080" w:hanging="720"/>
+        <w:tabs>
+          <w:tab w:val="num" w:pos="1080"/>
+        </w:tabs>
       </w:pPr>
       <w:r>
         <w:rPr>
@@ -4344,7 +4620,7 @@
       </w:pPr>
       <w:r>
         <w:rPr>
-          <w:rFonts w:ascii="Courier New" w:hAnsi="Courier New"/>
+          <w:rFonts w:ascii="Times New Roman" w:hAnsi="Times New Roman" w:eastAsia="Times New Roman" w:cs="Times New Roman"/>
           <w:b w:val="0"/>
           <w:color w:val="000000"/>
           <w:sz w:val="20"/>
@@ -4361,6 +4637,10 @@
           <w:ilvl w:val="1"/>
           <w:numId w:val="32"/>
         </w:numPr>
+        <w:ind w:left="1080" w:hanging="720"/>
+        <w:tabs>
+          <w:tab w:val="num" w:pos="1080"/>
+        </w:tabs>
       </w:pPr>
       <w:r>
         <w:rPr>
@@ -4396,7 +4676,7 @@
       </w:pPr>
       <w:r>
         <w:rPr>
-          <w:rFonts w:ascii="Courier New" w:hAnsi="Courier New"/>
+          <w:rFonts w:ascii="Times New Roman" w:hAnsi="Times New Roman" w:eastAsia="Times New Roman" w:cs="Times New Roman"/>
           <w:b w:val="0"/>
           <w:color w:val="000000"/>
           <w:sz w:val="20"/>
@@ -4413,6 +4693,10 @@
           <w:ilvl w:val="1"/>
           <w:numId w:val="32"/>
         </w:numPr>
+        <w:ind w:left="1080" w:hanging="720"/>
+        <w:tabs>
+          <w:tab w:val="num" w:pos="1080"/>
+        </w:tabs>
       </w:pPr>
       <w:r>
         <w:rPr>
@@ -4448,7 +4732,7 @@
       </w:pPr>
       <w:r>
         <w:rPr>
-          <w:rFonts w:ascii="Courier New" w:hAnsi="Courier New"/>
+          <w:rFonts w:ascii="Times New Roman" w:hAnsi="Times New Roman" w:eastAsia="Times New Roman" w:cs="Times New Roman"/>
           <w:b w:val="0"/>
           <w:color w:val="000000"/>
           <w:sz w:val="20"/>
@@ -4465,6 +4749,10 @@
           <w:ilvl w:val="1"/>
           <w:numId w:val="32"/>
         </w:numPr>
+        <w:ind w:left="1080" w:hanging="720"/>
+        <w:tabs>
+          <w:tab w:val="num" w:pos="1080"/>
+        </w:tabs>
       </w:pPr>
       <w:r>
         <w:rPr>
@@ -4500,7 +4788,7 @@
       </w:pPr>
       <w:r>
         <w:rPr>
-          <w:rFonts w:ascii="Courier New" w:hAnsi="Courier New"/>
+          <w:rFonts w:ascii="Times New Roman" w:hAnsi="Times New Roman" w:eastAsia="Times New Roman" w:cs="Times New Roman"/>
           <w:b w:val="0"/>
           <w:color w:val="000000"/>
           <w:sz w:val="20"/>
@@ -4590,6 +4878,10 @@
           <w:ilvl w:val="0"/>
           <w:numId w:val="32"/>
         </w:numPr>
+        <w:ind w:left="540" w:hanging="540"/>
+        <w:tabs>
+          <w:tab w:val="num" w:pos="540"/>
+        </w:tabs>
       </w:pPr>
       <w:bookmarkStart w:id="111" w:name="F11"/>
       <w:r>
@@ -4610,6 +4902,10 @@
           <w:ilvl w:val="1"/>
           <w:numId w:val="32"/>
         </w:numPr>
+        <w:ind w:left="1080" w:hanging="720"/>
+        <w:tabs>
+          <w:tab w:val="num" w:pos="1080"/>
+        </w:tabs>
       </w:pPr>
       <w:r>
         <w:rPr>
@@ -4645,7 +4941,7 @@
       </w:pPr>
       <w:r>
         <w:rPr>
-          <w:rFonts w:ascii="Courier New" w:hAnsi="Courier New"/>
+          <w:rFonts w:ascii="Times New Roman" w:hAnsi="Times New Roman" w:eastAsia="Times New Roman" w:cs="Times New Roman"/>
           <w:b w:val="0"/>
           <w:color w:val="000000"/>
           <w:sz w:val="20"/>
@@ -4662,6 +4958,10 @@
           <w:ilvl w:val="1"/>
           <w:numId w:val="32"/>
         </w:numPr>
+        <w:ind w:left="1080" w:hanging="720"/>
+        <w:tabs>
+          <w:tab w:val="num" w:pos="1080"/>
+        </w:tabs>
       </w:pPr>
       <w:r>
         <w:rPr>
@@ -4697,7 +4997,7 @@
       </w:pPr>
       <w:r>
         <w:rPr>
-          <w:rFonts w:ascii="Courier New" w:hAnsi="Courier New"/>
+          <w:rFonts w:ascii="Times New Roman" w:hAnsi="Times New Roman" w:eastAsia="Times New Roman" w:cs="Times New Roman"/>
           <w:b w:val="0"/>
           <w:color w:val="000000"/>
           <w:sz w:val="20"/>
@@ -4714,6 +5014,10 @@
           <w:ilvl w:val="1"/>
           <w:numId w:val="32"/>
         </w:numPr>
+        <w:ind w:left="1080" w:hanging="720"/>
+        <w:tabs>
+          <w:tab w:val="num" w:pos="1080"/>
+        </w:tabs>
       </w:pPr>
       <w:r>
         <w:rPr>
@@ -4749,7 +5053,7 @@
       </w:pPr>
       <w:r>
         <w:rPr>
-          <w:rFonts w:ascii="Courier New" w:hAnsi="Courier New"/>
+          <w:rFonts w:ascii="Times New Roman" w:hAnsi="Times New Roman" w:eastAsia="Times New Roman" w:cs="Times New Roman"/>
           <w:b w:val="0"/>
           <w:color w:val="000000"/>
           <w:sz w:val="20"/>
@@ -4768,7 +5072,7 @@
       </w:pPr>
       <w:r>
         <w:rPr>
-          <w:rFonts w:ascii="Courier New" w:hAnsi="Courier New"/>
+          <w:rFonts w:ascii="Times New Roman" w:hAnsi="Times New Roman" w:eastAsia="Times New Roman" w:cs="Times New Roman"/>
           <w:b w:val="0"/>
           <w:color w:val="000000"/>
           <w:sz w:val="20"/>
@@ -4858,6 +5162,10 @@
           <w:ilvl w:val="0"/>
           <w:numId w:val="32"/>
         </w:numPr>
+        <w:ind w:left="540" w:hanging="540"/>
+        <w:tabs>
+          <w:tab w:val="num" w:pos="540"/>
+        </w:tabs>
       </w:pPr>
       <w:bookmarkStart w:id="121" w:name="Appendix"/>
       <w:r>
@@ -8138,7 +8446,7 @@
       <w:jc w:val="both"/>
     </w:pPr>
     <w:rPr>
-      <w:rFonts w:ascii="Times New Roman" w:hAnsi="Times New Roman" w:cs="Times New Roman"/>
+      <w:rFonts w:ascii="Times New Roman" w:hAnsi="Times New Roman" w:eastAsia="Times New Roman" w:cs="Times New Roman"/>
       <w:kern w:val="0"/>
       <w:sz w:val="26"/>
       <w:lang w:val="vi"/>
@@ -8165,7 +8473,7 @@
       <w:outlineLvl w:val="0"/>
     </w:pPr>
     <w:rPr>
-      <w:rFonts w:eastAsiaTheme="majorEastAsia" w:cstheme="majorBidi"/>
+      <w:rFonts w:ascii="Times New Roman" w:hAnsi="Times New Roman" w:eastAsia="Times New Roman" w:cs="Times New Roman"/>
       <w:b/>
       <w:kern w:val="2"/>
       <w:szCs w:val="32"/>
@@ -8196,6 +8504,7 @@
       <w:szCs w:val="36"/>
       <w:lang w:val="en-US"/>
       <w14:ligatures w14:val="standardContextual"/>
+      <w:rFonts w:ascii="Times New Roman" w:hAnsi="Times New Roman" w:eastAsia="Times New Roman" w:cs="Times New Roman"/>
     </w:rPr>
   </w:style>
   <w:style w:type="paragraph" w:styleId="Heading3">
@@ -8517,6 +8826,9 @@
       <w:spacing w:before="0" w:after="0"/>
       <w:ind w:left="261" w:firstLine="0"/>
     </w:pPr>
+    <w:rPr>
+      <w:rFonts w:ascii="Times New Roman" w:hAnsi="Times New Roman" w:eastAsia="Times New Roman" w:cs="Times New Roman"/>
+    </w:rPr>
   </w:style>
   <w:style w:type="paragraph" w:styleId="TOC1">
     <w:name w:val="toc 1"/>
@@ -8534,6 +8846,9 @@
       <w:ind w:firstLine="0"/>
       <w:jc w:val="left"/>
     </w:pPr>
+    <w:rPr>
+      <w:rFonts w:ascii="Times New Roman" w:hAnsi="Times New Roman" w:eastAsia="Times New Roman" w:cs="Times New Roman"/>
+    </w:rPr>
   </w:style>
   <w:style w:type="paragraph" w:styleId="TOC3">
     <w:name w:val="toc 3"/>
@@ -8972,7 +9287,7 @@
       <w:contextualSpacing/>
     </w:pPr>
     <w:rPr>
-      <w:rFonts w:asciiTheme="majorHAnsi" w:eastAsiaTheme="majorEastAsia" w:hAnsiTheme="majorHAnsi" w:cstheme="majorBidi"/>
+      <w:rFonts w:ascii="Times New Roman" w:hAnsi="Times New Roman" w:eastAsia="Times New Roman" w:cs="Times New Roman"/>
       <w:spacing w:val="-10"/>
       <w:kern w:val="28"/>
       <w:sz w:val="56"/>

</xml_diff>